<commit_message>
adicionando pastas, leitura de imagem
</commit_message>
<xml_diff>
--- a/models/MODELO_LAUDO.docx
+++ b/models/MODELO_LAUDO.docx
@@ -4823,7 +4823,6 @@
           <w:bCs/>
           <w:sz w:val="24"/>
           <w:szCs w:val="24"/>
-          <w:highlight w:val="yellow"/>
         </w:rPr>
         <w:t>#TRATAMENTO</w:t>
       </w:r>
@@ -4833,7 +4832,6 @@
           <w:bCs/>
           <w:sz w:val="24"/>
           <w:szCs w:val="24"/>
-          <w:highlight w:val="yellow"/>
         </w:rPr>
         <w:t xml:space="preserve"> </w:t>
       </w:r>
@@ -6793,62 +6791,7 @@
                       </wps:spPr>
                       <wps:txbx>
                         <w:txbxContent>
-                          <w:p>
-                            <w:r>
-                              <w:rPr>
-                                <w:noProof/>
-                                <w:lang w:eastAsia="pt-BR"/>
-                              </w:rPr>
-                              <w:drawing>
-                                <wp:inline distT="0" distB="0" distL="0" distR="0" wp14:anchorId="32D2B7B6" wp14:editId="58DE987B">
-                                  <wp:extent cx="992505" cy="273685"/>
-                                  <wp:effectExtent l="0" t="0" r="0" b="0"/>
-                                  <wp:docPr id="987020784" name="Imagem 3" descr="Logotipo&#10;&#10;O conteúdo gerado por IA pode estar incorreto."/>
-                                  <wp:cNvGraphicFramePr>
-                                    <a:graphicFrameLocks xmlns:a="http://schemas.openxmlformats.org/drawingml/2006/main" noChangeAspect="1"/>
-                                  </wp:cNvGraphicFramePr>
-                                  <a:graphic xmlns:a="http://schemas.openxmlformats.org/drawingml/2006/main">
-                                    <a:graphicData uri="http://schemas.openxmlformats.org/drawingml/2006/picture">
-                                      <pic:pic xmlns:pic="http://schemas.openxmlformats.org/drawingml/2006/picture">
-                                        <pic:nvPicPr>
-                                          <pic:cNvPr id="1268716187" name="Imagem 3" descr="Logotipo&#10;&#10;O conteúdo gerado por IA pode estar incorreto."/>
-                                          <pic:cNvPicPr>
-                                            <a:picLocks noChangeAspect="1" noChangeArrowheads="1"/>
-                                          </pic:cNvPicPr>
-                                        </pic:nvPicPr>
-                                        <pic:blipFill>
-                                          <a:blip r:embed="rId9">
-                                            <a:extLst>
-                                              <a:ext uri="{28A0092B-C50C-407E-A947-70E740481C1C}">
-                                                <a14:useLocalDpi xmlns:a14="http://schemas.microsoft.com/office/drawing/2010/main" val="0"/>
-                                              </a:ext>
-                                            </a:extLst>
-                                          </a:blip>
-                                          <a:srcRect/>
-                                          <a:stretch>
-                                            <a:fillRect/>
-                                          </a:stretch>
-                                        </pic:blipFill>
-                                        <pic:spPr bwMode="auto">
-                                          <a:xfrm>
-                                            <a:off x="0" y="0"/>
-                                            <a:ext cx="992505" cy="273685"/>
-                                          </a:xfrm>
-                                          <a:prstGeom prst="rect">
-                                            <a:avLst/>
-                                          </a:prstGeom>
-                                          <a:noFill/>
-                                          <a:ln>
-                                            <a:noFill/>
-                                          </a:ln>
-                                        </pic:spPr>
-                                      </pic:pic>
-                                    </a:graphicData>
-                                  </a:graphic>
-                                </wp:inline>
-                              </w:drawing>
-                            </w:r>
-                          </w:p>
+                          <w:p/>
                         </w:txbxContent>
                       </wps:txbx>
                       <wps:bodyPr rot="0" spcFirstLastPara="0" vertOverflow="overflow" horzOverflow="overflow" vert="horz" wrap="square" lIns="91440" tIns="45720" rIns="91440" bIns="45720" numCol="1" spcCol="0" rtlCol="0" fromWordArt="0" anchor="t" anchorCtr="0" forceAA="0" compatLnSpc="1">
@@ -6865,65 +6808,14 @@
           </mc:Choice>
           <mc:Fallback>
             <w:pict>
-              <v:shape w14:anchorId="1AB08A77" id="Caixa de Texto 14" o:spid="_x0000_s1027" type="#_x0000_t202" style="position:absolute;left:0;text-align:left;margin-left:340.3pt;margin-top:247.8pt;width:94.5pt;height:35.5pt;z-index:251662336;visibility:visible;mso-wrap-style:square;mso-wrap-distance-left:9pt;mso-wrap-distance-top:0;mso-wrap-distance-right:9pt;mso-wrap-distance-bottom:0;mso-position-horizontal:absolute;mso-position-horizontal-relative:text;mso-position-vertical:absolute;mso-position-vertical-relative:text;v-text-anchor:top" o:gfxdata="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" fillcolor="white [3201]" stroked="f" strokeweight=".5pt">
+              <v:shapetype w14:anchorId="1AB08A77" id="_x0000_t202" coordsize="21600,21600" o:spt="202" path="m,l,21600r21600,l21600,xe">
+                <v:stroke joinstyle="miter"/>
+                <v:path gradientshapeok="t" o:connecttype="rect"/>
+              </v:shapetype>
+              <v:shape id="Caixa de Texto 14" o:spid="_x0000_s1027" type="#_x0000_t202" style="position:absolute;left:0;text-align:left;margin-left:340.3pt;margin-top:247.8pt;width:94.5pt;height:35.5pt;z-index:251662336;visibility:visible;mso-wrap-style:square;mso-wrap-distance-left:9pt;mso-wrap-distance-top:0;mso-wrap-distance-right:9pt;mso-wrap-distance-bottom:0;mso-position-horizontal:absolute;mso-position-horizontal-relative:text;mso-position-vertical:absolute;mso-position-vertical-relative:text;v-text-anchor:top" o:gfxdata="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" fillcolor="white [3201]" stroked="f" strokeweight=".5pt">
                 <v:textbox>
                   <w:txbxContent>
-                    <w:p>
-                      <w:r>
-                        <w:rPr>
-                          <w:noProof/>
-                          <w:lang w:eastAsia="pt-BR"/>
-                        </w:rPr>
-                        <w:drawing>
-                          <wp:inline distT="0" distB="0" distL="0" distR="0" wp14:anchorId="32D2B7B6" wp14:editId="58DE987B">
-                            <wp:extent cx="992505" cy="273685"/>
-                            <wp:effectExtent l="0" t="0" r="0" b="0"/>
-                            <wp:docPr id="987020784" name="Imagem 3" descr="Logotipo&#10;&#10;O conteúdo gerado por IA pode estar incorreto."/>
-                            <wp:cNvGraphicFramePr>
-                              <a:graphicFrameLocks xmlns:a="http://schemas.openxmlformats.org/drawingml/2006/main" noChangeAspect="1"/>
-                            </wp:cNvGraphicFramePr>
-                            <a:graphic xmlns:a="http://schemas.openxmlformats.org/drawingml/2006/main">
-                              <a:graphicData uri="http://schemas.openxmlformats.org/drawingml/2006/picture">
-                                <pic:pic xmlns:pic="http://schemas.openxmlformats.org/drawingml/2006/picture">
-                                  <pic:nvPicPr>
-                                    <pic:cNvPr id="1268716187" name="Imagem 3" descr="Logotipo&#10;&#10;O conteúdo gerado por IA pode estar incorreto."/>
-                                    <pic:cNvPicPr>
-                                      <a:picLocks noChangeAspect="1" noChangeArrowheads="1"/>
-                                    </pic:cNvPicPr>
-                                  </pic:nvPicPr>
-                                  <pic:blipFill>
-                                    <a:blip r:embed="rId10">
-                                      <a:extLst>
-                                        <a:ext uri="{28A0092B-C50C-407E-A947-70E740481C1C}">
-                                          <a14:useLocalDpi xmlns:a14="http://schemas.microsoft.com/office/drawing/2010/main" val="0"/>
-                                        </a:ext>
-                                      </a:extLst>
-                                    </a:blip>
-                                    <a:srcRect/>
-                                    <a:stretch>
-                                      <a:fillRect/>
-                                    </a:stretch>
-                                  </pic:blipFill>
-                                  <pic:spPr bwMode="auto">
-                                    <a:xfrm>
-                                      <a:off x="0" y="0"/>
-                                      <a:ext cx="992505" cy="273685"/>
-                                    </a:xfrm>
-                                    <a:prstGeom prst="rect">
-                                      <a:avLst/>
-                                    </a:prstGeom>
-                                    <a:noFill/>
-                                    <a:ln>
-                                      <a:noFill/>
-                                    </a:ln>
-                                  </pic:spPr>
-                                </pic:pic>
-                              </a:graphicData>
-                            </a:graphic>
-                          </wp:inline>
-                        </w:drawing>
-                      </w:r>
-                    </w:p>
+                    <w:p/>
                   </w:txbxContent>
                 </v:textbox>
               </v:shape>
@@ -7072,62 +6964,7 @@
                       </wps:spPr>
                       <wps:txbx>
                         <w:txbxContent>
-                          <w:p>
-                            <w:r>
-                              <w:rPr>
-                                <w:noProof/>
-                                <w:lang w:eastAsia="pt-BR"/>
-                              </w:rPr>
-                              <w:drawing>
-                                <wp:inline distT="0" distB="0" distL="0" distR="0" wp14:anchorId="05690A4F" wp14:editId="29BD3518">
-                                  <wp:extent cx="992505" cy="273685"/>
-                                  <wp:effectExtent l="0" t="0" r="0" b="0"/>
-                                  <wp:docPr id="940050286" name="Imagem 3" descr="Logotipo&#10;&#10;O conteúdo gerado por IA pode estar incorreto."/>
-                                  <wp:cNvGraphicFramePr>
-                                    <a:graphicFrameLocks xmlns:a="http://schemas.openxmlformats.org/drawingml/2006/main" noChangeAspect="1"/>
-                                  </wp:cNvGraphicFramePr>
-                                  <a:graphic xmlns:a="http://schemas.openxmlformats.org/drawingml/2006/main">
-                                    <a:graphicData uri="http://schemas.openxmlformats.org/drawingml/2006/picture">
-                                      <pic:pic xmlns:pic="http://schemas.openxmlformats.org/drawingml/2006/picture">
-                                        <pic:nvPicPr>
-                                          <pic:cNvPr id="1268716187" name="Imagem 3" descr="Logotipo&#10;&#10;O conteúdo gerado por IA pode estar incorreto."/>
-                                          <pic:cNvPicPr>
-                                            <a:picLocks noChangeAspect="1" noChangeArrowheads="1"/>
-                                          </pic:cNvPicPr>
-                                        </pic:nvPicPr>
-                                        <pic:blipFill>
-                                          <a:blip r:embed="rId9">
-                                            <a:extLst>
-                                              <a:ext uri="{28A0092B-C50C-407E-A947-70E740481C1C}">
-                                                <a14:useLocalDpi xmlns:a14="http://schemas.microsoft.com/office/drawing/2010/main" val="0"/>
-                                              </a:ext>
-                                            </a:extLst>
-                                          </a:blip>
-                                          <a:srcRect/>
-                                          <a:stretch>
-                                            <a:fillRect/>
-                                          </a:stretch>
-                                        </pic:blipFill>
-                                        <pic:spPr bwMode="auto">
-                                          <a:xfrm>
-                                            <a:off x="0" y="0"/>
-                                            <a:ext cx="992505" cy="273685"/>
-                                          </a:xfrm>
-                                          <a:prstGeom prst="rect">
-                                            <a:avLst/>
-                                          </a:prstGeom>
-                                          <a:noFill/>
-                                          <a:ln>
-                                            <a:noFill/>
-                                          </a:ln>
-                                        </pic:spPr>
-                                      </pic:pic>
-                                    </a:graphicData>
-                                  </a:graphic>
-                                </wp:inline>
-                              </w:drawing>
-                            </w:r>
-                          </w:p>
+                          <w:p/>
                         </w:txbxContent>
                       </wps:txbx>
                       <wps:bodyPr rot="0" spcFirstLastPara="0" vertOverflow="overflow" horzOverflow="overflow" vert="horz" wrap="square" lIns="91440" tIns="45720" rIns="91440" bIns="45720" numCol="1" spcCol="0" rtlCol="0" fromWordArt="0" anchor="t" anchorCtr="0" forceAA="0" compatLnSpc="1">
@@ -7147,62 +6984,7 @@
               <v:shape w14:anchorId="5E47AE31" id="_x0000_s1028" type="#_x0000_t202" style="position:absolute;left:0;text-align:left;margin-left:340.05pt;margin-top:247.4pt;width:94.5pt;height:35.5pt;z-index:251664384;visibility:visible;mso-wrap-style:square;mso-wrap-distance-left:9pt;mso-wrap-distance-top:0;mso-wrap-distance-right:9pt;mso-wrap-distance-bottom:0;mso-position-horizontal:absolute;mso-position-horizontal-relative:text;mso-position-vertical:absolute;mso-position-vertical-relative:text;v-text-anchor:top" o:gfxdata="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" fillcolor="white [3201]" stroked="f" strokeweight=".5pt">
                 <v:textbox>
                   <w:txbxContent>
-                    <w:p>
-                      <w:r>
-                        <w:rPr>
-                          <w:noProof/>
-                          <w:lang w:eastAsia="pt-BR"/>
-                        </w:rPr>
-                        <w:drawing>
-                          <wp:inline distT="0" distB="0" distL="0" distR="0" wp14:anchorId="05690A4F" wp14:editId="29BD3518">
-                            <wp:extent cx="992505" cy="273685"/>
-                            <wp:effectExtent l="0" t="0" r="0" b="0"/>
-                            <wp:docPr id="940050286" name="Imagem 3" descr="Logotipo&#10;&#10;O conteúdo gerado por IA pode estar incorreto."/>
-                            <wp:cNvGraphicFramePr>
-                              <a:graphicFrameLocks xmlns:a="http://schemas.openxmlformats.org/drawingml/2006/main" noChangeAspect="1"/>
-                            </wp:cNvGraphicFramePr>
-                            <a:graphic xmlns:a="http://schemas.openxmlformats.org/drawingml/2006/main">
-                              <a:graphicData uri="http://schemas.openxmlformats.org/drawingml/2006/picture">
-                                <pic:pic xmlns:pic="http://schemas.openxmlformats.org/drawingml/2006/picture">
-                                  <pic:nvPicPr>
-                                    <pic:cNvPr id="1268716187" name="Imagem 3" descr="Logotipo&#10;&#10;O conteúdo gerado por IA pode estar incorreto."/>
-                                    <pic:cNvPicPr>
-                                      <a:picLocks noChangeAspect="1" noChangeArrowheads="1"/>
-                                    </pic:cNvPicPr>
-                                  </pic:nvPicPr>
-                                  <pic:blipFill>
-                                    <a:blip r:embed="rId10">
-                                      <a:extLst>
-                                        <a:ext uri="{28A0092B-C50C-407E-A947-70E740481C1C}">
-                                          <a14:useLocalDpi xmlns:a14="http://schemas.microsoft.com/office/drawing/2010/main" val="0"/>
-                                        </a:ext>
-                                      </a:extLst>
-                                    </a:blip>
-                                    <a:srcRect/>
-                                    <a:stretch>
-                                      <a:fillRect/>
-                                    </a:stretch>
-                                  </pic:blipFill>
-                                  <pic:spPr bwMode="auto">
-                                    <a:xfrm>
-                                      <a:off x="0" y="0"/>
-                                      <a:ext cx="992505" cy="273685"/>
-                                    </a:xfrm>
-                                    <a:prstGeom prst="rect">
-                                      <a:avLst/>
-                                    </a:prstGeom>
-                                    <a:noFill/>
-                                    <a:ln>
-                                      <a:noFill/>
-                                    </a:ln>
-                                  </pic:spPr>
-                                </pic:pic>
-                              </a:graphicData>
-                            </a:graphic>
-                          </wp:inline>
-                        </w:drawing>
-                      </w:r>
-                    </w:p>
+                    <w:p/>
                   </w:txbxContent>
                 </v:textbox>
               </v:shape>
@@ -7495,40 +7277,40 @@
         </w:rPr>
         <w:t>#IMAGEM_SOLO</w:t>
       </w:r>
+    </w:p>
+    <w:p>
+      <w:pPr>
+        <w:spacing w:after="0" w:line="360" w:lineRule="auto"/>
+        <w:jc w:val="both"/>
+        <w:rPr>
+          <w:rFonts w:ascii="Cambria" w:hAnsi="Cambria"/>
+          <w:b/>
+          <w:bCs/>
+          <w:sz w:val="24"/>
+          <w:szCs w:val="24"/>
+        </w:rPr>
+      </w:pPr>
+      <w:r>
+        <w:rPr>
+          <w:rFonts w:ascii="Cambria" w:hAnsi="Cambria"/>
+          <w:sz w:val="24"/>
+          <w:szCs w:val="24"/>
+        </w:rPr>
+        <w:tab/>
+        <w:t xml:space="preserve">A pedologia na região é predominada por </w:t>
+      </w:r>
+      <w:r>
+        <w:rPr>
+          <w:rFonts w:ascii="Cambria" w:hAnsi="Cambria"/>
+          <w:b/>
+          <w:bCs/>
+          <w:sz w:val="24"/>
+          <w:szCs w:val="24"/>
+        </w:rPr>
+        <w:t>#TIPO_SOLO</w:t>
+      </w:r>
       <w:bookmarkStart w:id="26" w:name="_GoBack"/>
       <w:bookmarkEnd w:id="26"/>
-    </w:p>
-    <w:p>
-      <w:pPr>
-        <w:spacing w:after="0" w:line="360" w:lineRule="auto"/>
-        <w:jc w:val="both"/>
-        <w:rPr>
-          <w:rFonts w:ascii="Cambria" w:hAnsi="Cambria"/>
-          <w:b/>
-          <w:bCs/>
-          <w:sz w:val="24"/>
-          <w:szCs w:val="24"/>
-        </w:rPr>
-      </w:pPr>
-      <w:r>
-        <w:rPr>
-          <w:rFonts w:ascii="Cambria" w:hAnsi="Cambria"/>
-          <w:sz w:val="24"/>
-          <w:szCs w:val="24"/>
-        </w:rPr>
-        <w:tab/>
-        <w:t xml:space="preserve">A pedologia na região é predominada por </w:t>
-      </w:r>
-      <w:r>
-        <w:rPr>
-          <w:rFonts w:ascii="Cambria" w:hAnsi="Cambria"/>
-          <w:b/>
-          <w:bCs/>
-          <w:sz w:val="24"/>
-          <w:szCs w:val="24"/>
-        </w:rPr>
-        <w:t>#TIPO_SOLO</w:t>
-      </w:r>
     </w:p>
     <w:p>
       <w:pPr>
@@ -14977,11 +14759,17 @@
         <w:jc w:val="center"/>
         <w:rPr>
           <w:rFonts w:asciiTheme="majorHAnsi" w:hAnsiTheme="majorHAnsi"/>
-          <w:sz w:val="24"/>
-          <w:szCs w:val="24"/>
-        </w:rPr>
-      </w:pPr>
-      <w:r>
+          <w:b/>
+          <w:bCs/>
+          <w:sz w:val="24"/>
+          <w:szCs w:val="24"/>
+        </w:rPr>
+      </w:pPr>
+    </w:p>
+    <w:p>
+      <w:pPr>
+        <w:spacing w:after="0" w:line="360" w:lineRule="auto"/>
+        <w:jc w:val="center"/>
         <w:rPr>
           <w:rFonts w:asciiTheme="majorHAnsi" w:hAnsiTheme="majorHAnsi"/>
           <w:b/>
@@ -14989,58 +14777,8 @@
           <w:sz w:val="24"/>
           <w:szCs w:val="24"/>
         </w:rPr>
-        <w:t>#SUBSTITUIR_CIT</w:t>
-      </w:r>
-    </w:p>
-    <w:p>
-      <w:pPr>
-        <w:rPr>
-          <w:rFonts w:asciiTheme="majorHAnsi" w:hAnsiTheme="majorHAnsi"/>
-          <w:sz w:val="24"/>
-          <w:szCs w:val="24"/>
-        </w:rPr>
-      </w:pPr>
-      <w:r>
-        <w:rPr>
-          <w:rFonts w:asciiTheme="majorHAnsi" w:hAnsiTheme="majorHAnsi"/>
-          <w:sz w:val="24"/>
-          <w:szCs w:val="24"/>
-        </w:rPr>
-        <w:br w:type="page"/>
-      </w:r>
-    </w:p>
-    <w:p>
-      <w:pPr>
-        <w:spacing w:after="0" w:line="360" w:lineRule="auto"/>
-        <w:jc w:val="center"/>
-        <w:rPr>
-          <w:rFonts w:asciiTheme="majorHAnsi" w:hAnsiTheme="majorHAnsi"/>
-          <w:sz w:val="24"/>
-          <w:szCs w:val="24"/>
-        </w:rPr>
-      </w:pPr>
-    </w:p>
-    <w:p>
-      <w:pPr>
-        <w:rPr>
-          <w:rFonts w:asciiTheme="majorHAnsi" w:hAnsiTheme="majorHAnsi"/>
-          <w:sz w:val="24"/>
-          <w:szCs w:val="24"/>
-        </w:rPr>
-      </w:pPr>
-      <w:r>
-        <w:rPr>
-          <w:rFonts w:asciiTheme="majorHAnsi" w:hAnsiTheme="majorHAnsi"/>
-          <w:sz w:val="24"/>
-          <w:szCs w:val="24"/>
-        </w:rPr>
-        <w:br w:type="page"/>
-      </w:r>
-    </w:p>
-    <w:p>
-      <w:pPr>
-        <w:spacing w:after="0" w:line="360" w:lineRule="auto"/>
-        <w:jc w:val="center"/>
+      </w:pPr>
+      <w:r>
         <w:rPr>
           <w:rFonts w:asciiTheme="majorHAnsi" w:hAnsiTheme="majorHAnsi"/>
           <w:b/>
@@ -15048,8 +14786,13 @@
           <w:sz w:val="24"/>
           <w:szCs w:val="24"/>
         </w:rPr>
-      </w:pPr>
-      <w:r>
+        <w:t>#SUBSTITUIR_CIT</w:t>
+      </w:r>
+    </w:p>
+    <w:p>
+      <w:pPr>
+        <w:spacing w:after="0" w:line="360" w:lineRule="auto"/>
+        <w:jc w:val="center"/>
         <w:rPr>
           <w:rFonts w:asciiTheme="majorHAnsi" w:hAnsiTheme="majorHAnsi"/>
           <w:b/>
@@ -15057,9 +14800,7 @@
           <w:sz w:val="24"/>
           <w:szCs w:val="24"/>
         </w:rPr>
-        <w:lastRenderedPageBreak/>
-        <w:t>RECIBO DO CADASTRO AMBIENTAL RURAL – CAR</w:t>
-      </w:r>
+      </w:pPr>
     </w:p>
     <w:p>
       <w:pPr>
@@ -15073,13 +14814,130 @@
           <w:szCs w:val="24"/>
         </w:rPr>
       </w:pPr>
-      <w:r>
+    </w:p>
+    <w:p>
+      <w:pPr>
+        <w:spacing w:after="0" w:line="360" w:lineRule="auto"/>
+        <w:jc w:val="center"/>
+        <w:rPr>
+          <w:rFonts w:asciiTheme="majorHAnsi" w:hAnsiTheme="majorHAnsi"/>
+          <w:sz w:val="24"/>
+          <w:szCs w:val="24"/>
+        </w:rPr>
+      </w:pPr>
+    </w:p>
+    <w:p>
+      <w:pPr>
+        <w:rPr>
+          <w:rFonts w:asciiTheme="majorHAnsi" w:hAnsiTheme="majorHAnsi"/>
+          <w:sz w:val="24"/>
+          <w:szCs w:val="24"/>
+        </w:rPr>
+      </w:pPr>
+      <w:r>
+        <w:rPr>
+          <w:rFonts w:asciiTheme="majorHAnsi" w:hAnsiTheme="majorHAnsi"/>
+          <w:sz w:val="24"/>
+          <w:szCs w:val="24"/>
+        </w:rPr>
+        <w:br w:type="page"/>
+      </w:r>
+    </w:p>
+    <w:p>
+      <w:pPr>
+        <w:spacing w:after="0" w:line="360" w:lineRule="auto"/>
+        <w:jc w:val="center"/>
+        <w:rPr>
+          <w:rFonts w:asciiTheme="majorHAnsi" w:hAnsiTheme="majorHAnsi"/>
+          <w:sz w:val="24"/>
+          <w:szCs w:val="24"/>
+        </w:rPr>
+      </w:pPr>
+    </w:p>
+    <w:p>
+      <w:pPr>
+        <w:rPr>
+          <w:rFonts w:asciiTheme="majorHAnsi" w:hAnsiTheme="majorHAnsi"/>
+          <w:sz w:val="24"/>
+          <w:szCs w:val="24"/>
+        </w:rPr>
+      </w:pPr>
+    </w:p>
+    <w:p>
+      <w:pPr>
+        <w:spacing w:after="0" w:line="360" w:lineRule="auto"/>
+        <w:jc w:val="center"/>
+        <w:rPr>
+          <w:rFonts w:asciiTheme="majorHAnsi" w:hAnsiTheme="majorHAnsi"/>
+          <w:b/>
+          <w:bCs/>
+          <w:sz w:val="24"/>
+          <w:szCs w:val="24"/>
+        </w:rPr>
+      </w:pPr>
+      <w:r>
+        <w:rPr>
+          <w:rFonts w:asciiTheme="majorHAnsi" w:hAnsiTheme="majorHAnsi"/>
+          <w:b/>
+          <w:bCs/>
+          <w:sz w:val="24"/>
+          <w:szCs w:val="24"/>
+        </w:rPr>
+        <w:t>RECIBO DO CADASTRO AMBIENTAL RURAL – CAR</w:t>
+      </w:r>
+    </w:p>
+    <w:p>
+      <w:pPr>
+        <w:spacing w:after="0" w:line="360" w:lineRule="auto"/>
+        <w:jc w:val="center"/>
+        <w:rPr>
+          <w:rFonts w:asciiTheme="majorHAnsi" w:hAnsiTheme="majorHAnsi"/>
+          <w:b/>
+          <w:bCs/>
+          <w:sz w:val="24"/>
+          <w:szCs w:val="24"/>
+        </w:rPr>
+      </w:pPr>
+    </w:p>
+    <w:p>
+      <w:pPr>
+        <w:spacing w:after="0" w:line="360" w:lineRule="auto"/>
+        <w:jc w:val="center"/>
         <w:rPr>
           <w:noProof/>
           <w:lang w:eastAsia="pt-BR"/>
         </w:rPr>
+      </w:pPr>
+      <w:r>
+        <w:rPr>
+          <w:noProof/>
+          <w:lang w:eastAsia="pt-BR"/>
+        </w:rPr>
         <w:t>#SUBSTITUIR_CAR</w:t>
       </w:r>
+    </w:p>
+    <w:p>
+      <w:pPr>
+        <w:spacing w:after="0" w:line="360" w:lineRule="auto"/>
+        <w:jc w:val="center"/>
+        <w:rPr>
+          <w:noProof/>
+          <w:lang w:eastAsia="pt-BR"/>
+        </w:rPr>
+      </w:pPr>
+    </w:p>
+    <w:p>
+      <w:pPr>
+        <w:spacing w:after="0" w:line="360" w:lineRule="auto"/>
+        <w:jc w:val="center"/>
+        <w:rPr>
+          <w:rFonts w:asciiTheme="majorHAnsi" w:hAnsiTheme="majorHAnsi"/>
+          <w:b/>
+          <w:bCs/>
+          <w:sz w:val="24"/>
+          <w:szCs w:val="24"/>
+        </w:rPr>
+      </w:pPr>
     </w:p>
     <w:p>
       <w:pPr>
@@ -15349,7 +15207,7 @@
             <w:sz w:val="20"/>
             <w:szCs w:val="20"/>
           </w:rPr>
-          <w:t>20</w:t>
+          <w:t>23</w:t>
         </w:r>
         <w:r>
           <w:rPr>
@@ -15499,7 +15357,7 @@
         <v:path o:extrusionok="f" gradientshapeok="t" o:connecttype="rect"/>
         <o:lock v:ext="edit" aspectratio="t"/>
       </v:shapetype>
-      <v:shape id="_x0000_i1044" type="#_x0000_t75" style="width:132.75pt;height:170.25pt;visibility:visible;mso-wrap-style:square" o:bullet="t">
+      <v:shape id="_x0000_i1035" type="#_x0000_t75" style="width:132.75pt;height:170.25pt;visibility:visible;mso-wrap-style:square" o:bullet="t">
         <v:imagedata r:id="rId1" o:title="D'Agro_Logo_10"/>
       </v:shape>
     </w:pict>
@@ -17447,7 +17305,7 @@
 </file>
 
 <file path=customXml/itemProps1.xml><?xml version="1.0" encoding="utf-8"?>
-<ds:datastoreItem xmlns:ds="http://schemas.openxmlformats.org/officeDocument/2006/customXml" ds:itemID="{B0168A5E-FABC-4179-8160-705FE1AB1FD2}">
+<ds:datastoreItem xmlns:ds="http://schemas.openxmlformats.org/officeDocument/2006/customXml" ds:itemID="{6998B9EB-1164-4FA6-A403-4886A6609519}">
   <ds:schemaRefs>
     <ds:schemaRef ds:uri="http://schemas.openxmlformats.org/officeDocument/2006/bibliography"/>
   </ds:schemaRefs>

</xml_diff>